<commit_message>
staff achievements import work now
</commit_message>
<xml_diff>
--- a/scholarapp/samples/CV Abet Imane Haidar 2024.docx
+++ b/scholarapp/samples/CV Abet Imane Haidar 2024.docx
@@ -2227,6 +2227,7 @@
           <w:pPr>
             <w:pStyle w:val="Footer"/>
             <w:widowControl w:val="false"/>
+            <w:suppressAutoHyphens w:val="true"/>
             <w:spacing w:before="0" w:after="0"/>
             <w:jc w:val="left"/>
             <w:rPr>
@@ -2263,6 +2264,7 @@
           <w:pPr>
             <w:pStyle w:val="Footer"/>
             <w:widowControl w:val="false"/>
+            <w:suppressAutoHyphens w:val="true"/>
             <w:spacing w:before="0" w:after="0"/>
             <w:ind w:left="720" w:hanging="0"/>
             <w:jc w:val="right"/>
@@ -2286,7 +2288,7 @@
           </w:r>
           <w:r>
             <w:rPr>
-              <w:rFonts w:eastAsia="Times New Roman" w:cs="Calibri" w:cstheme="minorHAnsi"/>
+              <w:rFonts w:eastAsia="Times New Roman" w:cs="Calibri"/>
               <w:b/>
               <w:color w:val="0070C0"/>
               <w:kern w:val="0"/>
@@ -4519,6 +4521,7 @@
     <w:rsid w:val="00f07c1a"/>
     <w:pPr>
       <w:widowControl w:val="false"/>
+      <w:suppressAutoHyphens w:val="true"/>
       <w:bidi w:val="0"/>
       <w:spacing w:lineRule="auto" w:line="276" w:before="0" w:after="200"/>
       <w:jc w:val="left"/>
@@ -4730,6 +4733,7 @@
     <w:rsid w:val="00fd3c42"/>
     <w:pPr>
       <w:widowControl/>
+      <w:suppressAutoHyphens w:val="true"/>
       <w:bidi w:val="0"/>
       <w:spacing w:lineRule="auto" w:line="240" w:before="0" w:after="0"/>
       <w:jc w:val="left"/>

</xml_diff>